<commit_message>
maj figure size params for matric fihures
</commit_message>
<xml_diff>
--- a/Versions-html-and-docx/section_synthese_v6.docx
+++ b/Versions-html-and-docx/section_synthese_v6.docx
@@ -1249,7 +1249,7 @@
       <w:r>
         <w:drawing>
           <wp:inline xmlns:a="http://schemas.openxmlformats.org/drawingml/2006/main" xmlns:pic="http://schemas.openxmlformats.org/drawingml/2006/picture">
-            <wp:extent cx="5943600" cy="5708073"/>
+            <wp:extent cx="5943600" cy="5048865"/>
             <wp:docPr id="7" name="Picture 7"/>
             <wp:cNvGraphicFramePr>
               <a:graphicFrameLocks noChangeAspect="1"/>
@@ -1270,7 +1270,7 @@
                   <pic:spPr>
                     <a:xfrm>
                       <a:off x="0" y="0"/>
-                      <a:ext cx="5943600" cy="5708073"/>
+                      <a:ext cx="5943600" cy="5048865"/>
                     </a:xfrm>
                     <a:prstGeom prst="rect"/>
                   </pic:spPr>
@@ -1300,7 +1300,7 @@
       <w:r>
         <w:drawing>
           <wp:inline xmlns:a="http://schemas.openxmlformats.org/drawingml/2006/main" xmlns:pic="http://schemas.openxmlformats.org/drawingml/2006/picture">
-            <wp:extent cx="5943600" cy="6228934"/>
+            <wp:extent cx="5943600" cy="6415041"/>
             <wp:docPr id="8" name="Picture 8"/>
             <wp:cNvGraphicFramePr>
               <a:graphicFrameLocks noChangeAspect="1"/>
@@ -1321,7 +1321,7 @@
                   <pic:spPr>
                     <a:xfrm>
                       <a:off x="0" y="0"/>
-                      <a:ext cx="5943600" cy="6228934"/>
+                      <a:ext cx="5943600" cy="6415041"/>
                     </a:xfrm>
                     <a:prstGeom prst="rect"/>
                   </pic:spPr>

</xml_diff>